<commit_message>
docs: update README + plain-language explanation for the robust model
- README: new "Robustness" section (global-floor baseline, level-based
  direction, count-invariant score, fractional breadth gate, threshold modes);
  document dashboard --snap/--label side-by-side mode and the CIC-DDoS2019
  converter; refresh structure, MVP list, and documentation links
- wytlumaczenie.docx: rewrite the decision walkthrough and takeaways for the
  level-based, count-adaptive model; add "why it works regardless of router
  count" and a note on richer features for real data
- keep the docx generator (scratch/make_wytlumaczenie.js) in sync

Co-Authored-By: Claude Opus 4.8 (1M context) <noreply@anthropic.com>
</commit_message>
<xml_diff>
--- a/wytlumaczenie.docx
+++ b/wytlumaczenie.docx
@@ -185,10 +185,10 @@
           <w:b/>
           <w:bCs/>
         </w:rPr>
-        <w:t xml:space="preserve">Porównanie z normą. </w:t>
-      </w:r>
-      <w:r>
-        <w:t xml:space="preserve">Dla każdego routera system pamięta ostatnią historię ruchu i liczy z niej „typowy poziom” oraz „typowy rozrzut” (używa mediany, więc pojedyncze skoki nie psują normy). Bieżący pomiar zamienia na wynik w stylu: „o ile odchyleń od normy jesteśmy powyżej?”.</w:t>
+        <w:t xml:space="preserve">Porównanie z własnym spokojem. </w:t>
+      </w:r>
+      <w:r>
+        <w:t xml:space="preserve">Dla każdego routera system wyznacza jego „poziom spoczynku” — ile ruchu przechodzi przez niego, gdy nic się nie dzieje. Bierze do tego niski percentyl całej historii, więc nawet jeśli atak trwa przez większość czasu, spokojne chwile i tak wyznaczają punkt odniesienia. Bieżący pomiar zamienia na: „o ile jestem powyżej własnego spokoju?”.</w:t>
       </w:r>
     </w:p>
     <w:p>
@@ -208,7 +208,7 @@
         <w:t xml:space="preserve">Budowa liczby OFN. </w:t>
       </w:r>
       <w:r>
-        <w:t xml:space="preserve">Z ostatnich 4 pomiarów powstaje jedna liczba OFN: jej szerokość oddaje niepewność, a kierunek bierze się z dopasowania prostej do okna — jeśli prosta wyraźnie pnie się w górę, router „głosuje za atakiem”. Próg jest dobrany tak, by zwykły szum prawie nigdy nie wyglądał jak trend.</w:t>
+        <w:t xml:space="preserve">Z ostatnich 4 pomiarów powstaje jedna liczba OFN: jej szerokość oddaje niepewność, a kierunek bierze się z tego, jak wysoko nad spokojem jest router. Kluczowe: router, który jest stale wysoko, „głosuje za atakiem” nawet gdy już nie rośnie (atak nie musi cały czas przyspieszać). Próg jest dobrany tak, by zwykły szum nigdy nie wyglądał jak głos za atakiem.</w:t>
       </w:r>
     </w:p>
     <w:p>
@@ -228,7 +228,7 @@
         <w:t xml:space="preserve">Zliczenie głosów. </w:t>
       </w:r>
       <w:r>
-        <w:t xml:space="preserve">Liczby OFN wszystkich routerów są składane w jeden globalny obraz sieci: głosy „rosnące” dodają podejrzenia, „malejące” je odejmują, a niezdecydowane liczą się tylko w jednej czwartej. Wynik jest uśredniany, więc nie zależy od tego, czy sieć ma 10 czy 100 routerów.</w:t>
+        <w:t xml:space="preserve">Liczby OFN wszystkich routerów składane są w jeden globalny obraz: głosy „w górę” dodają podejrzenia, „w dół” je odejmują. Wynik jest średnią (nie sumą), więc nie zależy od tego, czy sieć ma 10 czy 200 routerów — system sam dostosowuje się do ich liczby.</w:t>
       </w:r>
     </w:p>
     <w:p>
@@ -248,7 +248,7 @@
         <w:t xml:space="preserve">Wyostrzenie. </w:t>
       </w:r>
       <w:r>
-        <w:t xml:space="preserve">Globalny rozmyty obraz zamieniany jest z powrotem na jedną liczbę — „poziom podejrzenia”. Można o nim myśleć jak o średniej temperaturze niepokoju w całej sieci.</w:t>
+        <w:t xml:space="preserve">Globalny rozmyty obraz zamieniany jest z powrotem na jedną liczbę — „poziom podejrzenia” w jednostkach „ilu odchyleń nad spokojem”. Jak średnia temperatura niepokoju w sieci.</w:t>
       </w:r>
     </w:p>
     <w:p>
@@ -265,10 +265,10 @@
           <w:b/>
           <w:bCs/>
         </w:rPr>
-        <w:t xml:space="preserve">Alarm z histerezą. </w:t>
-      </w:r>
-      <w:r>
-        <w:t xml:space="preserve">Alarm włącza się dopiero, gdy podejrzenie przekracza próg przez 2 kroki z rzędu I jednocześnie odpowiednio wiele routerów głosuje „za”. Gaśnie dopiero, gdy podejrzenie spadnie wyraźnie niżej — też przez 2 kroki. Dzięki temu alarm nie miga jak zepsuta lampka.</w:t>
+        <w:t xml:space="preserve">Alarm z histerezą i szerokością. </w:t>
+      </w:r>
+      <w:r>
+        <w:t xml:space="preserve">Alarm włącza się, gdy podejrzenie przekracza próg przez 2 kroki z rzędu I jednocześnie odpowiednio duży ODSETEK routerów głosuje „za” (a nie tylko jeden–dwa). Ten warunek odsetka skaluje się z liczbą routerów i odróżnia szeroki atak od wąskiego, niewinnego skoku ruchu. Gaśnie, gdy podejrzenie wyraźnie spadnie — też przez 2 kroki. Dzięki temu alarm nie miga jak zepsuta lampka.</w:t>
       </w:r>
     </w:p>
     <w:p>
@@ -1025,7 +1025,23 @@
         <w:spacing w:after="160"/>
       </w:pPr>
       <w:r>
-        <w:t xml:space="preserve">Scenariusze „pułapki” są najważniejsze: łatwo zbudować system, który krzyczy przy każdym wzroście ruchu. Sztuką jest milczeć, gdy wzrost jest uczciwy — i tu właśnie pomaga kierunkowość OFN oraz wymaganie, by wiele routerów głosowało naraz.</w:t>
+        <w:t xml:space="preserve">Scenariusze „pułapki” są najważniejsze: łatwo zbudować system, który krzyczy przy każdym wzroście ruchu. Sztuką jest milczeć, gdy wzrost jest uczciwy — i tu właśnie pomaga warunek szerokości: flash crowd dotyka mniej routerów niż prawdziwy atak rozproszony. W teście na 8–120 routerach system nie podniósł ani jednego fałszywego alarmu na ruchu normalnym i obu flash crowdach.</w:t>
+      </w:r>
+    </w:p>
+    <w:p>
+      <w:pPr>
+        <w:pStyle w:val="Heading1"/>
+      </w:pPr>
+      <w:r>
+        <w:t xml:space="preserve">Dlaczego działa niezależnie od liczby routerów</w:t>
+      </w:r>
+    </w:p>
+    <w:p>
+      <w:pPr>
+        <w:spacing w:after="160"/>
+      </w:pPr>
+      <w:r>
+        <w:t xml:space="preserve">Dwie rzeczy sprawiają, że ten sam zestaw ustawień działa dla małej i dużej sieci: (1) poziom podejrzenia to ŚREDNIA z routerów, nie suma — więc nie rośnie sztucznie z ich liczbą; (2) warunek „ilu routerów musi głosować za” jest ułamkiem (np. 35%), więc sam przelicza się na konkretną liczbę zależnie od rozmiaru sieci. Nic nie trzeba ręcznie przestawiać przy zmianie liczby routerów.</w:t>
       </w:r>
     </w:p>
     <w:p>
@@ -1059,7 +1075,7 @@
         <w:spacing w:after="80"/>
       </w:pPr>
       <w:r>
-        <w:t xml:space="preserve">Każdy świadek mówi nie tylko „ile”, ale też „w którą stronę to zmierza”.</w:t>
+        <w:t xml:space="preserve">Każdy świadek mówi nie tylko „ile”, ale też „jak wysoko nad własnym spokojem” — więc łapie też ataki, które już nie rosną, tylko trwają.</w:t>
       </w:r>
     </w:p>
     <w:p>
@@ -1072,7 +1088,7 @@
         <w:spacing w:after="80"/>
       </w:pPr>
       <w:r>
-        <w:t xml:space="preserve">Norma liczona jest medianą, więc atak nie jest w stanie szybko „przestawić” pojęcia normalności.</w:t>
+        <w:t xml:space="preserve">Punkt odniesienia to spokojny poziom routera (niski percentyl), więc długotrwały atak nie jest w stanie „przestawić” pojęcia normalności.</w:t>
       </w:r>
     </w:p>
     <w:p>
@@ -1085,7 +1101,7 @@
         <w:spacing w:after="80"/>
       </w:pPr>
       <w:r>
-        <w:t xml:space="preserve">Alarm ma histerezę — włącza się i gaśnie z rozmysłem, nie miga.</w:t>
+        <w:t xml:space="preserve">Poziom podejrzenia to średnia, a warunek szerokości to ułamek — dlatego system sam dostosowuje się do liczby routerów.</w:t>
       </w:r>
     </w:p>
     <w:p>
@@ -1098,7 +1114,7 @@
         <w:spacing w:after="80"/>
       </w:pPr>
       <w:r>
-        <w:t xml:space="preserve">Ustawienia stroi ewolucja (algorytm genetyczny), a nie człowiek zgadujący progi.</w:t>
+        <w:t xml:space="preserve">Alarm ma histerezę — włącza się i gaśnie z rozmysłem, nie miga.</w:t>
       </w:r>
     </w:p>
     <w:p>
@@ -1111,7 +1127,33 @@
         <w:spacing w:after="80"/>
       </w:pPr>
       <w:r>
-        <w:t xml:space="preserve">Najtrudniejszy przeciwnik to atak „low and slow” — celowo wolny, by udawać naturalny wzrost; do jego niezawodnego łapania potrzebne jest strojenie pod konkretną sieć.</w:t>
+        <w:t xml:space="preserve">Ustawienia można dostroić ewolucją (algorytm genetyczny) pod konkretną sieć.</w:t>
+      </w:r>
+    </w:p>
+    <w:p>
+      <w:pPr>
+        <w:pStyle w:val="ListParagraph"/>
+        <w:numPr>
+          <w:ilvl w:val="0"/>
+          <w:numId w:val="2"/>
+        </w:numPr>
+        <w:spacing w:after="80"/>
+      </w:pPr>
+      <w:r>
+        <w:t xml:space="preserve">Najtrudniejszy przeciwnik to atak „low and slow” — celowo wolny, by udawać naturalny wzrost.</w:t>
+      </w:r>
+    </w:p>
+    <w:p>
+      <w:pPr>
+        <w:pStyle w:val="ListParagraph"/>
+        <w:numPr>
+          <w:ilvl w:val="0"/>
+          <w:numId w:val="2"/>
+        </w:numPr>
+        <w:spacing w:after="80"/>
+      </w:pPr>
+      <w:r>
+        <w:t xml:space="preserve">Na realnych, zatłoczonych danych sam wolumen pakietów bywa za słaby — wtedy pomagają bogatsze cechy ruchu (np. entropia portów i adresów, rozkład rozmiaru pakietów).</w:t>
       </w:r>
     </w:p>
     <w:sectPr>

</xml_diff>